<commit_message>
Actualizado el ejercicio de DDL hasta la pregunta 17
</commit_message>
<xml_diff>
--- a/SEGUNDO TRIMESTRE/EJERCICIO-1/Ejercicio DDL1.docx
+++ b/SEGUNDO TRIMESTRE/EJERCICIO-1/Ejercicio DDL1.docx
@@ -1,6 +1,6 @@
 
 <file path=word/document.xml><?xml version="1.0" encoding="utf-8"?>
-<w:document xmlns:wpc="http://schemas.microsoft.com/office/word/2010/wordprocessingCanvas" xmlns:cx="http://schemas.microsoft.com/office/drawing/2014/chartex" xmlns:cx1="http://schemas.microsoft.com/office/drawing/2015/9/8/chartex" xmlns:cx2="http://schemas.microsoft.com/office/drawing/2015/10/21/chartex" xmlns:cx3="http://schemas.microsoft.com/office/drawing/2016/5/9/chartex" xmlns:cx4="http://schemas.microsoft.com/office/drawing/2016/5/10/chartex" xmlns:cx5="http://schemas.microsoft.com/office/drawing/2016/5/11/chartex" xmlns:cx6="http://schemas.microsoft.com/office/drawing/2016/5/12/chartex" xmlns:cx7="http://schemas.microsoft.com/office/drawing/2016/5/13/chartex" xmlns:cx8="http://schemas.microsoft.com/office/drawing/2016/5/14/chartex" xmlns:mc="http://schemas.openxmlformats.org/markup-compatibility/2006" xmlns:aink="http://schemas.microsoft.com/office/drawing/2016/ink" xmlns:am3d="http://schemas.microsoft.com/office/drawing/2017/model3d" xmlns:o="urn:schemas-microsoft-com:office:office" xmlns:r="http://schemas.openxmlformats.org/officeDocument/2006/relationships" xmlns:m="http://schemas.openxmlformats.org/officeDocument/2006/math" xmlns:v="urn:schemas-microsoft-com:vml" xmlns:wp14="http://schemas.microsoft.com/office/word/2010/wordprocessingDrawing" xmlns:wp="http://schemas.openxmlformats.org/drawingml/2006/wordprocessingDrawing" xmlns:w10="urn:schemas-microsoft-com:office:word" xmlns:w="http://schemas.openxmlformats.org/wordprocessingml/2006/main" xmlns:w14="http://schemas.microsoft.com/office/word/2010/wordml" xmlns:w15="http://schemas.microsoft.com/office/word/2012/wordml" xmlns:w16cex="http://schemas.microsoft.com/office/word/2018/wordml/cex" xmlns:w16cid="http://schemas.microsoft.com/office/word/2016/wordml/cid" xmlns:w16="http://schemas.microsoft.com/office/word/2018/wordml" xmlns:w16sdtdh="http://schemas.microsoft.com/office/word/2020/wordml/sdtdatahash" xmlns:w16se="http://schemas.microsoft.com/office/word/2015/wordml/symex" xmlns:wpg="http://schemas.microsoft.com/office/word/2010/wordprocessingGroup" xmlns:wpi="http://schemas.microsoft.com/office/word/2010/wordprocessingInk" xmlns:wne="http://schemas.microsoft.com/office/word/2006/wordml" xmlns:wps="http://schemas.microsoft.com/office/word/2010/wordprocessingShape" mc:Ignorable="w14 w15 w16se w16cid w16 w16cex w16sdtdh wp14">
+<w:document xmlns:wpc="http://schemas.microsoft.com/office/word/2010/wordprocessingCanvas" xmlns:cx="http://schemas.microsoft.com/office/drawing/2014/chartex" xmlns:cx1="http://schemas.microsoft.com/office/drawing/2015/9/8/chartex" xmlns:cx2="http://schemas.microsoft.com/office/drawing/2015/10/21/chartex" xmlns:cx3="http://schemas.microsoft.com/office/drawing/2016/5/9/chartex" xmlns:cx4="http://schemas.microsoft.com/office/drawing/2016/5/10/chartex" xmlns:cx5="http://schemas.microsoft.com/office/drawing/2016/5/11/chartex" xmlns:cx6="http://schemas.microsoft.com/office/drawing/2016/5/12/chartex" xmlns:cx7="http://schemas.microsoft.com/office/drawing/2016/5/13/chartex" xmlns:cx8="http://schemas.microsoft.com/office/drawing/2016/5/14/chartex" xmlns:mc="http://schemas.openxmlformats.org/markup-compatibility/2006" xmlns:aink="http://schemas.microsoft.com/office/drawing/2016/ink" xmlns:am3d="http://schemas.microsoft.com/office/drawing/2017/model3d" xmlns:o="urn:schemas-microsoft-com:office:office" xmlns:oel="http://schemas.microsoft.com/office/2019/extlst" xmlns:r="http://schemas.openxmlformats.org/officeDocument/2006/relationships" xmlns:m="http://schemas.openxmlformats.org/officeDocument/2006/math" xmlns:v="urn:schemas-microsoft-com:vml" xmlns:wp14="http://schemas.microsoft.com/office/word/2010/wordprocessingDrawing" xmlns:wp="http://schemas.openxmlformats.org/drawingml/2006/wordprocessingDrawing" xmlns:w10="urn:schemas-microsoft-com:office:word" xmlns:w="http://schemas.openxmlformats.org/wordprocessingml/2006/main" xmlns:w14="http://schemas.microsoft.com/office/word/2010/wordml" xmlns:w15="http://schemas.microsoft.com/office/word/2012/wordml" xmlns:w16cex="http://schemas.microsoft.com/office/word/2018/wordml/cex" xmlns:w16cid="http://schemas.microsoft.com/office/word/2016/wordml/cid" xmlns:w16="http://schemas.microsoft.com/office/word/2018/wordml" xmlns:w16du="http://schemas.microsoft.com/office/word/2023/wordml/word16du" xmlns:w16sdtdh="http://schemas.microsoft.com/office/word/2020/wordml/sdtdatahash" xmlns:w16sdtfl="http://schemas.microsoft.com/office/word/2024/wordml/sdtformatlock" xmlns:w16se="http://schemas.microsoft.com/office/word/2015/wordml/symex" xmlns:wpg="http://schemas.microsoft.com/office/word/2010/wordprocessingGroup" xmlns:wpi="http://schemas.microsoft.com/office/word/2010/wordprocessingInk" xmlns:wne="http://schemas.microsoft.com/office/word/2006/wordml" xmlns:wps="http://schemas.microsoft.com/office/word/2010/wordprocessingShape" mc:Ignorable="w14 w15 w16se w16cid w16 w16cex w16sdtdh w16sdtfl w16du wp14">
   <w:body>
     <w:p>
       <w:pPr>
@@ -114,7 +114,6 @@
         <w:tblW w:w="10001" w:type="dxa"/>
         <w:tblInd w:w="-106" w:type="dxa"/>
         <w:tblCellMar>
-          <w:top w:w="0" w:type="dxa"/>
           <w:left w:w="96" w:type="dxa"/>
           <w:bottom w:w="67" w:type="dxa"/>
           <w:right w:w="115" w:type="dxa"/>
@@ -515,14 +514,12 @@
               <w:ind w:firstLine="0"/>
               <w:jc w:val="left"/>
             </w:pPr>
-            <w:proofErr w:type="spellStart"/>
             <w:r>
               <w:rPr>
                 <w:b/>
               </w:rPr>
               <w:t>Region</w:t>
             </w:r>
-            <w:proofErr w:type="spellEnd"/>
           </w:p>
         </w:tc>
         <w:tc>
@@ -619,14 +616,12 @@
               <w:ind w:firstLine="0"/>
               <w:jc w:val="left"/>
             </w:pPr>
-            <w:proofErr w:type="spellStart"/>
             <w:r>
               <w:rPr>
                 <w:b/>
               </w:rPr>
               <w:t>Dir</w:t>
             </w:r>
-            <w:proofErr w:type="spellEnd"/>
           </w:p>
         </w:tc>
         <w:tc>
@@ -1073,14 +1068,12 @@
               <w:ind w:firstLine="0"/>
               <w:jc w:val="left"/>
             </w:pPr>
-            <w:proofErr w:type="spellStart"/>
             <w:r>
               <w:rPr>
                 <w:b/>
               </w:rPr>
               <w:t>Numemp</w:t>
             </w:r>
-            <w:proofErr w:type="spellEnd"/>
           </w:p>
         </w:tc>
         <w:tc>
@@ -1551,13 +1544,8 @@
               <w:ind w:left="735" w:firstLine="0"/>
               <w:jc w:val="left"/>
             </w:pPr>
-            <w:proofErr w:type="spellStart"/>
-            <w:r>
-              <w:t>Dir</w:t>
-            </w:r>
-            <w:proofErr w:type="spellEnd"/>
-            <w:r>
-              <w:t xml:space="preserve"> ventas,</w:t>
+            <w:r>
+              <w:t>Dir ventas,</w:t>
             </w:r>
           </w:p>
           <w:p>
@@ -1566,13 +1554,8 @@
               <w:ind w:left="735" w:firstLine="0"/>
               <w:jc w:val="left"/>
             </w:pPr>
-            <w:proofErr w:type="spellStart"/>
-            <w:r>
-              <w:t>Dir</w:t>
-            </w:r>
-            <w:proofErr w:type="spellEnd"/>
-            <w:r>
-              <w:t xml:space="preserve"> general</w:t>
+            <w:r>
+              <w:t>Dir general</w:t>
             </w:r>
           </w:p>
         </w:tc>
@@ -1970,7 +1953,6 @@
         <w:tblW w:w="10001" w:type="dxa"/>
         <w:tblInd w:w="-106" w:type="dxa"/>
         <w:tblCellMar>
-          <w:top w:w="0" w:type="dxa"/>
           <w:left w:w="96" w:type="dxa"/>
           <w:bottom w:w="14" w:type="dxa"/>
           <w:right w:w="115" w:type="dxa"/>
@@ -2180,14 +2162,12 @@
               <w:ind w:firstLine="0"/>
               <w:jc w:val="left"/>
             </w:pPr>
-            <w:proofErr w:type="spellStart"/>
             <w:r>
               <w:rPr>
                 <w:b/>
               </w:rPr>
               <w:t>Numclie</w:t>
             </w:r>
-            <w:proofErr w:type="spellEnd"/>
           </w:p>
         </w:tc>
         <w:tc>
@@ -2380,14 +2360,12 @@
               <w:ind w:firstLine="0"/>
               <w:jc w:val="left"/>
             </w:pPr>
-            <w:proofErr w:type="spellStart"/>
             <w:r>
               <w:rPr>
                 <w:b/>
               </w:rPr>
               <w:t>Repclie</w:t>
             </w:r>
-            <w:proofErr w:type="spellEnd"/>
           </w:p>
         </w:tc>
         <w:tc>
@@ -2481,14 +2459,12 @@
               <w:ind w:firstLine="0"/>
               <w:jc w:val="left"/>
             </w:pPr>
-            <w:proofErr w:type="spellStart"/>
             <w:r>
               <w:rPr>
                 <w:b/>
               </w:rPr>
               <w:t>LimiteCredito</w:t>
             </w:r>
-            <w:proofErr w:type="spellEnd"/>
           </w:p>
         </w:tc>
         <w:tc>
@@ -2589,7 +2565,6 @@
         <w:tblW w:w="10001" w:type="dxa"/>
         <w:tblInd w:w="-106" w:type="dxa"/>
         <w:tblCellMar>
-          <w:top w:w="0" w:type="dxa"/>
           <w:left w:w="96" w:type="dxa"/>
           <w:bottom w:w="14" w:type="dxa"/>
           <w:right w:w="115" w:type="dxa"/>
@@ -2799,14 +2774,12 @@
               <w:ind w:firstLine="0"/>
               <w:jc w:val="left"/>
             </w:pPr>
-            <w:proofErr w:type="spellStart"/>
             <w:r>
               <w:rPr>
                 <w:b/>
               </w:rPr>
               <w:t>Idfab</w:t>
             </w:r>
-            <w:proofErr w:type="spellEnd"/>
           </w:p>
         </w:tc>
         <w:tc>
@@ -2978,14 +2951,12 @@
               <w:ind w:firstLine="0"/>
               <w:jc w:val="left"/>
             </w:pPr>
-            <w:proofErr w:type="spellStart"/>
             <w:r>
               <w:rPr>
                 <w:b/>
               </w:rPr>
               <w:t>Idproducto</w:t>
             </w:r>
-            <w:proofErr w:type="spellEnd"/>
           </w:p>
         </w:tc>
         <w:tc>
@@ -3631,14 +3602,12 @@
               <w:ind w:firstLine="0"/>
               <w:jc w:val="left"/>
             </w:pPr>
-            <w:proofErr w:type="spellStart"/>
             <w:r>
               <w:rPr>
                 <w:b/>
               </w:rPr>
               <w:t>Numpedido</w:t>
             </w:r>
-            <w:proofErr w:type="spellEnd"/>
           </w:p>
         </w:tc>
         <w:tc>
@@ -3725,14 +3694,12 @@
               <w:ind w:firstLine="0"/>
               <w:jc w:val="left"/>
             </w:pPr>
-            <w:proofErr w:type="spellStart"/>
             <w:r>
               <w:rPr>
                 <w:b/>
               </w:rPr>
               <w:t>Fechapedido</w:t>
             </w:r>
-            <w:proofErr w:type="spellEnd"/>
           </w:p>
         </w:tc>
         <w:tc>
@@ -3815,14 +3782,12 @@
               <w:ind w:firstLine="0"/>
               <w:jc w:val="left"/>
             </w:pPr>
-            <w:proofErr w:type="spellStart"/>
             <w:r>
               <w:rPr>
                 <w:b/>
               </w:rPr>
               <w:t>Clie</w:t>
             </w:r>
-            <w:proofErr w:type="spellEnd"/>
           </w:p>
         </w:tc>
         <w:tc>
@@ -3916,14 +3881,12 @@
               <w:ind w:firstLine="0"/>
               <w:jc w:val="left"/>
             </w:pPr>
-            <w:proofErr w:type="spellStart"/>
             <w:r>
               <w:rPr>
                 <w:b/>
               </w:rPr>
               <w:t>Rep</w:t>
             </w:r>
-            <w:proofErr w:type="spellEnd"/>
           </w:p>
         </w:tc>
         <w:tc>
@@ -4500,7 +4463,6 @@
         <w:tblW w:w="10001" w:type="dxa"/>
         <w:tblInd w:w="-106" w:type="dxa"/>
         <w:tblCellMar>
-          <w:top w:w="0" w:type="dxa"/>
           <w:left w:w="96" w:type="dxa"/>
           <w:bottom w:w="67" w:type="dxa"/>
           <w:right w:w="115" w:type="dxa"/>
@@ -4809,14 +4771,12 @@
               <w:ind w:firstLine="0"/>
               <w:jc w:val="left"/>
             </w:pPr>
-            <w:proofErr w:type="spellStart"/>
             <w:r>
               <w:rPr>
                 <w:b/>
               </w:rPr>
               <w:t>movil</w:t>
             </w:r>
-            <w:proofErr w:type="spellEnd"/>
           </w:p>
         </w:tc>
         <w:tc>
@@ -4915,15 +4875,7 @@
         <w:ind w:left="-5"/>
       </w:pPr>
       <w:r>
-        <w:t xml:space="preserve">4.- Poner como clave principal en P_PEDIDOS el campo </w:t>
-      </w:r>
-      <w:proofErr w:type="spellStart"/>
-      <w:r>
-        <w:t>numpedido</w:t>
-      </w:r>
-      <w:proofErr w:type="spellEnd"/>
-      <w:r>
-        <w:t>.</w:t>
+        <w:t>4.- Poner como clave principal en P_PEDIDOS el campo numpedido.</w:t>
       </w:r>
     </w:p>
     <w:p>
@@ -4936,10 +4888,7 @@
         <w:ind w:left="-5"/>
       </w:pPr>
       <w:r>
-        <w:t xml:space="preserve">5.- </w:t>
-      </w:r>
-      <w:r>
-        <w:t>Cambia de la tabla de P_EMPLEADOS el tipo de campo cuota y ventas a numérico de 10 dígitos con dos decimales.</w:t>
+        <w:t>5.- Cambia de la tabla de P_EMPLEADOS el tipo de campo cuota y ventas a numérico de 10 dígitos con dos decimales.</w:t>
       </w:r>
     </w:p>
     <w:p>
@@ -4965,15 +4914,7 @@
         <w:ind w:left="-5"/>
       </w:pPr>
       <w:r>
-        <w:t xml:space="preserve">7.- Ejecuta las </w:t>
-      </w:r>
-      <w:proofErr w:type="gramStart"/>
-      <w:r>
-        <w:t>siguientes  instrucciones</w:t>
-      </w:r>
-      <w:proofErr w:type="gramEnd"/>
-      <w:r>
-        <w:t>:</w:t>
+        <w:t>7.- Ejecuta las siguientes  instrucciones:</w:t>
       </w:r>
     </w:p>
     <w:p>
@@ -4986,27 +4927,7 @@
         <w:rPr>
           <w:b/>
         </w:rPr>
-        <w:t xml:space="preserve">INSERT INTO P_OFICINAS </w:t>
-      </w:r>
-      <w:proofErr w:type="gramStart"/>
-      <w:r>
-        <w:rPr>
-          <w:b/>
-        </w:rPr>
-        <w:t>VALUES</w:t>
-      </w:r>
-      <w:r>
-        <w:rPr>
-          <w:b/>
-        </w:rPr>
-        <w:t>(</w:t>
-      </w:r>
-      <w:proofErr w:type="gramEnd"/>
-      <w:r>
-        <w:rPr>
-          <w:b/>
-        </w:rPr>
-        <w:t>11, ‘MADRID’,’CENTRO’,100,100000,150000);</w:t>
+        <w:t>INSERT INTO P_OFICINAS VALUES(11, ‘MADRID’,’CENTRO’,100,100000,150000);</w:t>
       </w:r>
     </w:p>
     <w:p>
@@ -5069,10 +4990,7 @@
         <w:ind w:left="-5"/>
       </w:pPr>
       <w:r>
-        <w:t xml:space="preserve">Esta instrucción debe dar una excepción de ORACLE debido a que el empleado 110 </w:t>
-      </w:r>
-      <w:r>
-        <w:t>no está creado y hay una restricción creada diciendo que el campo jefe es un empleado de la empresa.</w:t>
+        <w:t>Esta instrucción debe dar una excepción de ORACLE debido a que el empleado 110 no está creado y hay una restricción creada diciendo que el campo jefe es un empleado de la empresa.</w:t>
       </w:r>
     </w:p>
     <w:p>
@@ -5151,13 +5069,7 @@
           <w:b/>
         </w:rPr>
         <w:tab/>
-        <w:t>11,’dir general’,’10/1</w:t>
-      </w:r>
-      <w:r>
-        <w:rPr>
-          <w:b/>
-        </w:rPr>
-        <w:t>0/2007’,100,10000,15000);</w:t>
+        <w:t>11,’dir general’,’10/10/2007’,100,10000,15000);</w:t>
       </w:r>
     </w:p>
     <w:p>
@@ -5188,11 +5100,9 @@
         </w:rPr>
         <w:t xml:space="preserve">SELECT * FROM P_EMPLEADOS; </w:t>
       </w:r>
-      <w:proofErr w:type="gramStart"/>
       <w:r>
         <w:t>para comprobar que ahora si ha creado el registro!!!</w:t>
       </w:r>
-      <w:proofErr w:type="gramEnd"/>
     </w:p>
     <w:p>
       <w:pPr>
@@ -5289,18 +5199,7 @@
         <w:ind w:left="-5"/>
       </w:pPr>
       <w:r>
-        <w:t xml:space="preserve">Ahora si nos debe </w:t>
-      </w:r>
-      <w:proofErr w:type="gramStart"/>
-      <w:r>
-        <w:t>dejar</w:t>
-      </w:r>
-      <w:proofErr w:type="gramEnd"/>
-      <w:r>
-        <w:t xml:space="preserve"> aunque el Jefe </w:t>
-      </w:r>
-      <w:r>
-        <w:t>110 no exista como empleado.</w:t>
+        <w:t>Ahora si nos debe dejar aunque el Jefe 110 no exista como empleado.</w:t>
       </w:r>
     </w:p>
     <w:p>
@@ -5354,117 +5253,79 @@
         <w:rPr>
           <w:b/>
         </w:rPr>
-        <w:t>DELETE FROM P_EMP</w:t>
+        <w:t>DELETE FROM P_EMPLEADOS WHERE numemp=101;</w:t>
+      </w:r>
+    </w:p>
+    <w:p>
+      <w:pPr>
+        <w:spacing w:after="550"/>
+        <w:ind w:left="-5"/>
+      </w:pPr>
+      <w:r>
+        <w:t>12.- Habilita la restricción. Ahora si debe dejar.</w:t>
+      </w:r>
+    </w:p>
+    <w:p>
+      <w:pPr>
+        <w:spacing w:after="550"/>
+        <w:ind w:left="-5"/>
+      </w:pPr>
+      <w:r>
+        <w:t>13.- Añade la restricción de integridad referencial entre P_OFICINAS Y P_EMPLEADOS. Denomínala FK_directoroficina. Y haz que al borrar una un dirrector de una oficina, se borren todas sus oficinas en cascada.</w:t>
+      </w:r>
+    </w:p>
+    <w:p>
+      <w:pPr>
+        <w:spacing w:after="514"/>
+        <w:ind w:left="-5"/>
+      </w:pPr>
+      <w:r>
+        <w:t xml:space="preserve">14.- Muestra cuales </w:t>
+      </w:r>
+      <w:r>
+        <w:rPr>
+          <w:u w:val="single"/>
+        </w:rPr>
+        <w:t>s</w:t>
+      </w:r>
+      <w:r>
+        <w:rPr>
+          <w:u w:val="single"/>
+        </w:rPr>
+        <w:t>on</w:t>
+      </w:r>
+      <w:r>
+        <w:t xml:space="preserve"> los nombres y tipo de las restricciones (CONSTRAINTS) de la tabla P_OFICINAS y P_EMPLEADOS.</w:t>
+      </w:r>
+    </w:p>
+    <w:p>
+      <w:pPr>
+        <w:spacing w:after="551"/>
+        <w:ind w:left="-5"/>
+      </w:pPr>
+      <w:r>
+        <w:t>15.- Borra la restricción que has creado en la pregunta 6.</w:t>
+      </w:r>
+    </w:p>
+    <w:p>
+      <w:pPr>
+        <w:spacing w:after="969" w:line="249" w:lineRule="auto"/>
+        <w:ind w:left="-5"/>
+        <w:jc w:val="left"/>
+      </w:pPr>
+      <w:r>
+        <w:lastRenderedPageBreak/>
+        <w:t xml:space="preserve">16.- Borra las tablas </w:t>
       </w:r>
       <w:r>
         <w:rPr>
           <w:b/>
         </w:rPr>
-        <w:t xml:space="preserve">LEADOS WHERE </w:t>
-      </w:r>
-      <w:proofErr w:type="spellStart"/>
-      <w:r>
-        <w:rPr>
-          <w:b/>
-        </w:rPr>
-        <w:t>numemp</w:t>
-      </w:r>
-      <w:proofErr w:type="spellEnd"/>
-      <w:r>
-        <w:rPr>
-          <w:b/>
-        </w:rPr>
-        <w:t>=101;</w:t>
-      </w:r>
-    </w:p>
-    <w:p>
-      <w:pPr>
-        <w:spacing w:after="550"/>
-        <w:ind w:left="-5"/>
-      </w:pPr>
-      <w:r>
-        <w:t>12.- Habilita la restricción. Ahora si debe dejar.</w:t>
-      </w:r>
-    </w:p>
-    <w:p>
-      <w:pPr>
-        <w:spacing w:after="550"/>
-        <w:ind w:left="-5"/>
-      </w:pPr>
-      <w:r>
-        <w:t xml:space="preserve">13.- Añade la restricción de integridad referencial entre P_OFICINAS Y P_EMPLEADOS. Denomínala </w:t>
-      </w:r>
-      <w:proofErr w:type="spellStart"/>
-      <w:r>
-        <w:t>FK_directoroficina</w:t>
-      </w:r>
-      <w:proofErr w:type="spellEnd"/>
-      <w:r>
-        <w:t xml:space="preserve">. Y haz que al borrar una un </w:t>
-      </w:r>
-      <w:proofErr w:type="spellStart"/>
-      <w:r>
-        <w:t>dirrector</w:t>
-      </w:r>
-      <w:proofErr w:type="spellEnd"/>
-      <w:r>
-        <w:t xml:space="preserve"> de una oficina, se borren to</w:t>
-      </w:r>
-      <w:r>
-        <w:t>das sus oficinas en cascada.</w:t>
-      </w:r>
-    </w:p>
-    <w:p>
-      <w:pPr>
-        <w:spacing w:after="514"/>
-        <w:ind w:left="-5"/>
-      </w:pPr>
-      <w:r>
-        <w:t>14.- Muestra cuales con los nombres y tipo de las restricciones (CONSTRAINTS) de la tabla P_OFICINAS y P_EMPLEADOS.</w:t>
-      </w:r>
-    </w:p>
-    <w:p>
-      <w:pPr>
-        <w:spacing w:after="551"/>
-        <w:ind w:left="-5"/>
-      </w:pPr>
-      <w:r>
-        <w:t>15.- Borra la restricción que has creado en la pregunta 6.</w:t>
-      </w:r>
-    </w:p>
-    <w:p>
-      <w:pPr>
-        <w:spacing w:after="969" w:line="249" w:lineRule="auto"/>
-        <w:ind w:left="-5"/>
-        <w:jc w:val="left"/>
-      </w:pPr>
-      <w:r>
-        <w:lastRenderedPageBreak/>
-        <w:t xml:space="preserve">16.- Borra las tablas </w:t>
-      </w:r>
-      <w:r>
-        <w:rPr>
-          <w:b/>
-        </w:rPr>
-        <w:t>P_PRODUCTOS, P_CLIENTES, P_OFI</w:t>
-      </w:r>
-      <w:r>
-        <w:rPr>
-          <w:b/>
-        </w:rPr>
-        <w:t>CINAS, P_EMPLEADOS, P_</w:t>
-      </w:r>
-      <w:proofErr w:type="gramStart"/>
-      <w:r>
-        <w:rPr>
-          <w:b/>
-        </w:rPr>
-        <w:t xml:space="preserve">PEDIDOS </w:t>
+        <w:t xml:space="preserve">P_PRODUCTOS, P_CLIENTES, P_OFICINAS, P_EMPLEADOS, P_PEDIDOS </w:t>
       </w:r>
       <w:r>
         <w:t>.</w:t>
       </w:r>
-      <w:proofErr w:type="gramEnd"/>
     </w:p>
     <w:p>
       <w:pPr>
@@ -5495,29 +5356,13 @@
         <w:ind w:left="-5"/>
       </w:pPr>
       <w:r>
-        <w:t xml:space="preserve">Ejecuta en </w:t>
-      </w:r>
-      <w:proofErr w:type="spellStart"/>
-      <w:r>
-        <w:t>SQLDeveloper</w:t>
-      </w:r>
-      <w:proofErr w:type="spellEnd"/>
-      <w:r>
-        <w:t xml:space="preserve"> el comando </w:t>
-      </w:r>
-      <w:proofErr w:type="spellStart"/>
+        <w:t xml:space="preserve">Ejecuta en SQLDeveloper el comando </w:t>
+      </w:r>
       <w:r>
         <w:rPr>
           <w:b/>
         </w:rPr>
-        <w:t>start</w:t>
-      </w:r>
-      <w:proofErr w:type="spellEnd"/>
-      <w:r>
-        <w:rPr>
-          <w:b/>
-        </w:rPr>
-        <w:t xml:space="preserve"> D:\PEDIDOS.SQL</w:t>
+        <w:t>start D:\PEDIDOS.SQL</w:t>
       </w:r>
     </w:p>
     <w:p>
@@ -5541,7 +5386,6 @@
         <w:tblW w:w="5520" w:type="dxa"/>
         <w:tblInd w:w="-106" w:type="dxa"/>
         <w:tblCellMar>
-          <w:top w:w="0" w:type="dxa"/>
           <w:left w:w="101" w:type="dxa"/>
           <w:bottom w:w="68" w:type="dxa"/>
           <w:right w:w="115" w:type="dxa"/>
@@ -5913,14 +5757,12 @@
               <w:ind w:left="5" w:firstLine="0"/>
               <w:jc w:val="left"/>
             </w:pPr>
-            <w:proofErr w:type="spellStart"/>
             <w:r>
               <w:rPr>
                 <w:b/>
               </w:rPr>
               <w:t>Region</w:t>
             </w:r>
-            <w:proofErr w:type="spellEnd"/>
           </w:p>
         </w:tc>
         <w:tc>
@@ -6008,14 +5850,12 @@
               <w:ind w:left="5" w:firstLine="0"/>
               <w:jc w:val="left"/>
             </w:pPr>
-            <w:proofErr w:type="spellStart"/>
             <w:r>
               <w:rPr>
                 <w:b/>
               </w:rPr>
               <w:t>Dir</w:t>
             </w:r>
-            <w:proofErr w:type="spellEnd"/>
           </w:p>
         </w:tc>
         <w:tc>
@@ -6273,14 +6113,12 @@
       <w:r>
         <w:t xml:space="preserve">19.- Crea una tabla (llamarla </w:t>
       </w:r>
-      <w:proofErr w:type="spellStart"/>
       <w:r>
         <w:rPr>
           <w:i/>
         </w:rPr>
         <w:t>nuevaempleados</w:t>
       </w:r>
-      <w:proofErr w:type="spellEnd"/>
       <w:r>
         <w:t xml:space="preserve">) que contenga las filas de la tabla </w:t>
       </w:r>
@@ -6311,14 +6149,12 @@
       <w:r>
         <w:t xml:space="preserve">20.- Crea una tabla (llamarla </w:t>
       </w:r>
-      <w:proofErr w:type="spellStart"/>
       <w:r>
         <w:rPr>
           <w:i/>
         </w:rPr>
         <w:t>nuevaoficinas</w:t>
       </w:r>
-      <w:proofErr w:type="spellEnd"/>
       <w:r>
         <w:t xml:space="preserve">) que contenga las filas de la tabla </w:t>
       </w:r>
@@ -6349,19 +6185,14 @@
       <w:r>
         <w:t xml:space="preserve">21.- Crea una tabla (llamarla </w:t>
       </w:r>
-      <w:proofErr w:type="spellStart"/>
       <w:r>
         <w:rPr>
           <w:i/>
         </w:rPr>
         <w:t>nuevaproductos</w:t>
       </w:r>
-      <w:proofErr w:type="spellEnd"/>
-      <w:r>
-        <w:t>) que contenga las filas d</w:t>
-      </w:r>
-      <w:r>
-        <w:t xml:space="preserve">e la tabla </w:t>
+      <w:r>
+        <w:t xml:space="preserve">) que contenga las filas de la tabla </w:t>
       </w:r>
       <w:r>
         <w:rPr>
@@ -6391,14 +6222,12 @@
       <w:r>
         <w:t xml:space="preserve">22.- Crea una tabla (llamarla </w:t>
       </w:r>
-      <w:proofErr w:type="spellStart"/>
       <w:r>
         <w:rPr>
           <w:i/>
         </w:rPr>
         <w:t>nuevapedidos</w:t>
       </w:r>
-      <w:proofErr w:type="spellEnd"/>
       <w:r>
         <w:t xml:space="preserve">) que contenga las filas de la tabla </w:t>
       </w:r>
@@ -6428,10 +6257,7 @@
         <w:ind w:left="-5"/>
       </w:pPr>
       <w:r>
-        <w:t xml:space="preserve">24.- Introducir </w:t>
-      </w:r>
-      <w:r>
-        <w:t>en la tabla NUEVAEMPLEADOS todos los empleados que han hecho 2 o más pedidos en el año 2007.</w:t>
+        <w:t>24.- Introducir en la tabla NUEVAEMPLEADOS todos los empleados que han hecho 2 o más pedidos en el año 2007.</w:t>
       </w:r>
     </w:p>
     <w:p>
@@ -6439,16 +6265,8 @@
         <w:ind w:left="-5"/>
       </w:pPr>
       <w:r>
-        <w:t xml:space="preserve">25.- Introducir en la tabla NUEVAEMPLEADOS un nuevo empleado con identificativo 999, </w:t>
-      </w:r>
-      <w:r>
-        <w:t>llamado Raúl González, su oficina será la oficina que más empleados tenga, y como jefe tendrá al empleado que más empleados tenga a su cargo, la cuota será de 10000 y las ventas serán NULL. (</w:t>
-      </w:r>
-      <w:proofErr w:type="spellStart"/>
-      <w:r>
-        <w:t>Update</w:t>
-      </w:r>
-      <w:proofErr w:type="spellEnd"/>
+        <w:t>25.- Introducir en la tabla NUEVAEMPLEADOS un nuevo empleado con identificativo 999, llamado Raúl González, su oficina será la oficina que más empleados tenga, y como jefe tendrá al empleado que más empleados tenga a su cargo, la cuota será de 10000 y las ventas serán NULL. (Update</w:t>
+      </w:r>
     </w:p>
     <w:p>
       <w:pPr>
@@ -6474,10 +6292,7 @@
         <w:t>Madrid</w:t>
       </w:r>
       <w:r>
-        <w:t>,</w:t>
-      </w:r>
-      <w:r>
-        <w:t xml:space="preserve"> con el número de oficina </w:t>
+        <w:t xml:space="preserve">, con el número de oficina </w:t>
       </w:r>
       <w:r>
         <w:rPr>
@@ -6522,10 +6337,7 @@
         <w:ind w:left="-5"/>
       </w:pPr>
       <w:r>
-        <w:t>28.- Añade a la tabla COMERCIALES</w:t>
-      </w:r>
-      <w:r>
-        <w:t xml:space="preserve"> los datos de los empleados que son directores de ventas.</w:t>
+        <w:t>28.- Añade a la tabla COMERCIALES los datos de los empleados que son directores de ventas.</w:t>
       </w:r>
     </w:p>
     <w:p>
@@ -6534,18 +6346,7 @@
         <w:ind w:left="-5"/>
       </w:pPr>
       <w:r>
-        <w:t xml:space="preserve">29.- Crea la tabla </w:t>
-      </w:r>
-      <w:proofErr w:type="spellStart"/>
-      <w:r>
-        <w:t>PedidosEnero</w:t>
-      </w:r>
-      <w:proofErr w:type="spellEnd"/>
-      <w:r>
-        <w:t xml:space="preserve"> con los datos (código del pedido, número de pedido, fecha del pedido, nombre del cliente, nombre del representante, e importe del pedido con IVA) de los pedidos reali</w:t>
-      </w:r>
-      <w:r>
-        <w:t>zados en enero. La clave deberá ser el código de pedidos.</w:t>
+        <w:t>29.- Crea la tabla PedidosEnero con los datos (código del pedido, número de pedido, fecha del pedido, nombre del cliente, nombre del representante, e importe del pedido con IVA) de los pedidos realizados en enero. La clave deberá ser el código de pedidos.</w:t>
       </w:r>
     </w:p>
     <w:p>
@@ -6563,15 +6364,7 @@
         <w:ind w:left="-5"/>
       </w:pPr>
       <w:r>
-        <w:t xml:space="preserve">31.- Poner el </w:t>
-      </w:r>
-      <w:proofErr w:type="spellStart"/>
-      <w:r>
-        <w:t>limite</w:t>
-      </w:r>
-      <w:proofErr w:type="spellEnd"/>
-      <w:r>
-        <w:t xml:space="preserve"> de crédito a 0 a los clientes que tienen como representantes empleados de la oficina 12.</w:t>
+        <w:t>31.- Poner el limite de crédito a 0 a los clientes que tienen como representantes empleados de la oficina 12.</w:t>
       </w:r>
     </w:p>
     <w:p>
@@ -6579,10 +6372,7 @@
         <w:ind w:left="-5"/>
       </w:pPr>
       <w:r>
-        <w:t>32.- Actualizar la cuota de</w:t>
-      </w:r>
-      <w:r>
-        <w:t xml:space="preserve"> los empleados. Esta cuota debe ser el objetivo de su oficina incrementado en un 1%.</w:t>
+        <w:t>32.- Actualizar la cuota de los empleados. Esta cuota debe ser el objetivo de su oficina incrementado en un 1%.</w:t>
       </w:r>
     </w:p>
     <w:p>
@@ -6591,23 +6381,7 @@
         <w:ind w:left="-5"/>
       </w:pPr>
       <w:r>
-        <w:t xml:space="preserve">33.- Borrar los pedidos del cliente </w:t>
-      </w:r>
-      <w:proofErr w:type="spellStart"/>
-      <w:r>
-        <w:t>Julian</w:t>
-      </w:r>
-      <w:proofErr w:type="spellEnd"/>
-      <w:r>
-        <w:t xml:space="preserve"> </w:t>
-      </w:r>
-      <w:proofErr w:type="spellStart"/>
-      <w:r>
-        <w:t>Lopez</w:t>
-      </w:r>
-      <w:proofErr w:type="spellEnd"/>
-      <w:r>
-        <w:t>.</w:t>
+        <w:t>33.- Borrar los pedidos del cliente Julian Lopez.</w:t>
       </w:r>
     </w:p>
     <w:p>
@@ -6642,10 +6416,7 @@
         <w:t xml:space="preserve">21 </w:t>
       </w:r>
       <w:r>
-        <w:t>a la of</w:t>
-      </w:r>
-      <w:r>
-        <w:t xml:space="preserve">icina </w:t>
+        <w:t xml:space="preserve">a la oficina </w:t>
       </w:r>
       <w:r>
         <w:rPr>
@@ -6720,14 +6491,12 @@
       <w:r>
         <w:t xml:space="preserve">38.- Recuperar los precios originales de los productos a partir de la tabla </w:t>
       </w:r>
-      <w:proofErr w:type="spellStart"/>
       <w:r>
         <w:rPr>
           <w:i/>
         </w:rPr>
         <w:t>nuevosproductos</w:t>
       </w:r>
-      <w:proofErr w:type="spellEnd"/>
       <w:r>
         <w:t>.</w:t>
       </w:r>
@@ -6749,14 +6518,12 @@
       <w:r>
         <w:t xml:space="preserve">39.- Recuperar las oficinas borradas a partir de la tabla </w:t>
       </w:r>
-      <w:proofErr w:type="spellStart"/>
       <w:r>
         <w:rPr>
           <w:i/>
         </w:rPr>
         <w:t>nuevaoficinas</w:t>
       </w:r>
-      <w:proofErr w:type="spellEnd"/>
       <w:r>
         <w:t>.</w:t>
       </w:r>
@@ -6778,14 +6545,12 @@
       <w:r>
         <w:t xml:space="preserve">40.- Recuperar los pedidos borrados en ejercicios anteriores a partir de la tabla </w:t>
       </w:r>
-      <w:proofErr w:type="spellStart"/>
       <w:r>
         <w:rPr>
           <w:i/>
         </w:rPr>
         <w:t>nuevapedidos</w:t>
       </w:r>
-      <w:proofErr w:type="spellEnd"/>
       <w:r>
         <w:t>.</w:t>
       </w:r>
@@ -6849,7 +6614,7 @@
 </file>
 
 <file path=word/endnotes.xml><?xml version="1.0" encoding="utf-8"?>
-<w:endnotes xmlns:wpc="http://schemas.microsoft.com/office/word/2010/wordprocessingCanvas" xmlns:cx="http://schemas.microsoft.com/office/drawing/2014/chartex" xmlns:cx1="http://schemas.microsoft.com/office/drawing/2015/9/8/chartex" xmlns:cx2="http://schemas.microsoft.com/office/drawing/2015/10/21/chartex" xmlns:cx3="http://schemas.microsoft.com/office/drawing/2016/5/9/chartex" xmlns:cx4="http://schemas.microsoft.com/office/drawing/2016/5/10/chartex" xmlns:cx5="http://schemas.microsoft.com/office/drawing/2016/5/11/chartex" xmlns:cx6="http://schemas.microsoft.com/office/drawing/2016/5/12/chartex" xmlns:cx7="http://schemas.microsoft.com/office/drawing/2016/5/13/chartex" xmlns:cx8="http://schemas.microsoft.com/office/drawing/2016/5/14/chartex" xmlns:mc="http://schemas.openxmlformats.org/markup-compatibility/2006" xmlns:aink="http://schemas.microsoft.com/office/drawing/2016/ink" xmlns:am3d="http://schemas.microsoft.com/office/drawing/2017/model3d" xmlns:o="urn:schemas-microsoft-com:office:office" xmlns:r="http://schemas.openxmlformats.org/officeDocument/2006/relationships" xmlns:m="http://schemas.openxmlformats.org/officeDocument/2006/math" xmlns:v="urn:schemas-microsoft-com:vml" xmlns:wp14="http://schemas.microsoft.com/office/word/2010/wordprocessingDrawing" xmlns:wp="http://schemas.openxmlformats.org/drawingml/2006/wordprocessingDrawing" xmlns:w10="urn:schemas-microsoft-com:office:word" xmlns:w="http://schemas.openxmlformats.org/wordprocessingml/2006/main" xmlns:w14="http://schemas.microsoft.com/office/word/2010/wordml" xmlns:w15="http://schemas.microsoft.com/office/word/2012/wordml" xmlns:w16cex="http://schemas.microsoft.com/office/word/2018/wordml/cex" xmlns:w16cid="http://schemas.microsoft.com/office/word/2016/wordml/cid" xmlns:w16="http://schemas.microsoft.com/office/word/2018/wordml" xmlns:w16sdtdh="http://schemas.microsoft.com/office/word/2020/wordml/sdtdatahash" xmlns:w16se="http://schemas.microsoft.com/office/word/2015/wordml/symex" xmlns:wpg="http://schemas.microsoft.com/office/word/2010/wordprocessingGroup" xmlns:wpi="http://schemas.microsoft.com/office/word/2010/wordprocessingInk" xmlns:wne="http://schemas.microsoft.com/office/word/2006/wordml" xmlns:wps="http://schemas.microsoft.com/office/word/2010/wordprocessingShape" mc:Ignorable="w14 w15 w16se w16cid w16 w16cex w16sdtdh wp14">
+<w:endnotes xmlns:wpc="http://schemas.microsoft.com/office/word/2010/wordprocessingCanvas" xmlns:cx="http://schemas.microsoft.com/office/drawing/2014/chartex" xmlns:cx1="http://schemas.microsoft.com/office/drawing/2015/9/8/chartex" xmlns:cx2="http://schemas.microsoft.com/office/drawing/2015/10/21/chartex" xmlns:cx3="http://schemas.microsoft.com/office/drawing/2016/5/9/chartex" xmlns:cx4="http://schemas.microsoft.com/office/drawing/2016/5/10/chartex" xmlns:cx5="http://schemas.microsoft.com/office/drawing/2016/5/11/chartex" xmlns:cx6="http://schemas.microsoft.com/office/drawing/2016/5/12/chartex" xmlns:cx7="http://schemas.microsoft.com/office/drawing/2016/5/13/chartex" xmlns:cx8="http://schemas.microsoft.com/office/drawing/2016/5/14/chartex" xmlns:mc="http://schemas.openxmlformats.org/markup-compatibility/2006" xmlns:aink="http://schemas.microsoft.com/office/drawing/2016/ink" xmlns:am3d="http://schemas.microsoft.com/office/drawing/2017/model3d" xmlns:o="urn:schemas-microsoft-com:office:office" xmlns:oel="http://schemas.microsoft.com/office/2019/extlst" xmlns:r="http://schemas.openxmlformats.org/officeDocument/2006/relationships" xmlns:m="http://schemas.openxmlformats.org/officeDocument/2006/math" xmlns:v="urn:schemas-microsoft-com:vml" xmlns:wp14="http://schemas.microsoft.com/office/word/2010/wordprocessingDrawing" xmlns:wp="http://schemas.openxmlformats.org/drawingml/2006/wordprocessingDrawing" xmlns:w10="urn:schemas-microsoft-com:office:word" xmlns:w="http://schemas.openxmlformats.org/wordprocessingml/2006/main" xmlns:w14="http://schemas.microsoft.com/office/word/2010/wordml" xmlns:w15="http://schemas.microsoft.com/office/word/2012/wordml" xmlns:w16cex="http://schemas.microsoft.com/office/word/2018/wordml/cex" xmlns:w16cid="http://schemas.microsoft.com/office/word/2016/wordml/cid" xmlns:w16="http://schemas.microsoft.com/office/word/2018/wordml" xmlns:w16du="http://schemas.microsoft.com/office/word/2023/wordml/word16du" xmlns:w16sdtdh="http://schemas.microsoft.com/office/word/2020/wordml/sdtdatahash" xmlns:w16sdtfl="http://schemas.microsoft.com/office/word/2024/wordml/sdtformatlock" xmlns:w16se="http://schemas.microsoft.com/office/word/2015/wordml/symex" xmlns:wpg="http://schemas.microsoft.com/office/word/2010/wordprocessingGroup" xmlns:wpi="http://schemas.microsoft.com/office/word/2010/wordprocessingInk" xmlns:wne="http://schemas.microsoft.com/office/word/2006/wordml" xmlns:wps="http://schemas.microsoft.com/office/word/2010/wordprocessingShape" mc:Ignorable="w14 w15 w16se w16cid w16 w16cex w16sdtdh w16sdtfl w16du wp14">
   <w:endnote w:type="separator" w:id="-1">
     <w:p>
       <w:pPr>
@@ -6874,7 +6639,7 @@
 </file>
 
 <file path=word/footer1.xml><?xml version="1.0" encoding="utf-8"?>
-<w:ftr xmlns:wpc="http://schemas.microsoft.com/office/word/2010/wordprocessingCanvas" xmlns:cx="http://schemas.microsoft.com/office/drawing/2014/chartex" xmlns:cx1="http://schemas.microsoft.com/office/drawing/2015/9/8/chartex" xmlns:cx2="http://schemas.microsoft.com/office/drawing/2015/10/21/chartex" xmlns:cx3="http://schemas.microsoft.com/office/drawing/2016/5/9/chartex" xmlns:cx4="http://schemas.microsoft.com/office/drawing/2016/5/10/chartex" xmlns:cx5="http://schemas.microsoft.com/office/drawing/2016/5/11/chartex" xmlns:cx6="http://schemas.microsoft.com/office/drawing/2016/5/12/chartex" xmlns:cx7="http://schemas.microsoft.com/office/drawing/2016/5/13/chartex" xmlns:cx8="http://schemas.microsoft.com/office/drawing/2016/5/14/chartex" xmlns:mc="http://schemas.openxmlformats.org/markup-compatibility/2006" xmlns:aink="http://schemas.microsoft.com/office/drawing/2016/ink" xmlns:am3d="http://schemas.microsoft.com/office/drawing/2017/model3d" xmlns:o="urn:schemas-microsoft-com:office:office" xmlns:r="http://schemas.openxmlformats.org/officeDocument/2006/relationships" xmlns:m="http://schemas.openxmlformats.org/officeDocument/2006/math" xmlns:v="urn:schemas-microsoft-com:vml" xmlns:wp14="http://schemas.microsoft.com/office/word/2010/wordprocessingDrawing" xmlns:wp="http://schemas.openxmlformats.org/drawingml/2006/wordprocessingDrawing" xmlns:w10="urn:schemas-microsoft-com:office:word" xmlns:w="http://schemas.openxmlformats.org/wordprocessingml/2006/main" xmlns:w14="http://schemas.microsoft.com/office/word/2010/wordml" xmlns:w15="http://schemas.microsoft.com/office/word/2012/wordml" xmlns:w16cex="http://schemas.microsoft.com/office/word/2018/wordml/cex" xmlns:w16cid="http://schemas.microsoft.com/office/word/2016/wordml/cid" xmlns:w16="http://schemas.microsoft.com/office/word/2018/wordml" xmlns:w16sdtdh="http://schemas.microsoft.com/office/word/2020/wordml/sdtdatahash" xmlns:w16se="http://schemas.microsoft.com/office/word/2015/wordml/symex" xmlns:wpg="http://schemas.microsoft.com/office/word/2010/wordprocessingGroup" xmlns:wpi="http://schemas.microsoft.com/office/word/2010/wordprocessingInk" xmlns:wne="http://schemas.microsoft.com/office/word/2006/wordml" xmlns:wps="http://schemas.microsoft.com/office/word/2010/wordprocessingShape" mc:Ignorable="w14 w15 w16se w16cid w16 w16cex w16sdtdh wp14">
+<w:ftr xmlns:wpc="http://schemas.microsoft.com/office/word/2010/wordprocessingCanvas" xmlns:cx="http://schemas.microsoft.com/office/drawing/2014/chartex" xmlns:cx1="http://schemas.microsoft.com/office/drawing/2015/9/8/chartex" xmlns:cx2="http://schemas.microsoft.com/office/drawing/2015/10/21/chartex" xmlns:cx3="http://schemas.microsoft.com/office/drawing/2016/5/9/chartex" xmlns:cx4="http://schemas.microsoft.com/office/drawing/2016/5/10/chartex" xmlns:cx5="http://schemas.microsoft.com/office/drawing/2016/5/11/chartex" xmlns:cx6="http://schemas.microsoft.com/office/drawing/2016/5/12/chartex" xmlns:cx7="http://schemas.microsoft.com/office/drawing/2016/5/13/chartex" xmlns:cx8="http://schemas.microsoft.com/office/drawing/2016/5/14/chartex" xmlns:mc="http://schemas.openxmlformats.org/markup-compatibility/2006" xmlns:aink="http://schemas.microsoft.com/office/drawing/2016/ink" xmlns:am3d="http://schemas.microsoft.com/office/drawing/2017/model3d" xmlns:o="urn:schemas-microsoft-com:office:office" xmlns:oel="http://schemas.microsoft.com/office/2019/extlst" xmlns:r="http://schemas.openxmlformats.org/officeDocument/2006/relationships" xmlns:m="http://schemas.openxmlformats.org/officeDocument/2006/math" xmlns:v="urn:schemas-microsoft-com:vml" xmlns:wp14="http://schemas.microsoft.com/office/word/2010/wordprocessingDrawing" xmlns:wp="http://schemas.openxmlformats.org/drawingml/2006/wordprocessingDrawing" xmlns:w10="urn:schemas-microsoft-com:office:word" xmlns:w="http://schemas.openxmlformats.org/wordprocessingml/2006/main" xmlns:w14="http://schemas.microsoft.com/office/word/2010/wordml" xmlns:w15="http://schemas.microsoft.com/office/word/2012/wordml" xmlns:w16cex="http://schemas.microsoft.com/office/word/2018/wordml/cex" xmlns:w16cid="http://schemas.microsoft.com/office/word/2016/wordml/cid" xmlns:w16="http://schemas.microsoft.com/office/word/2018/wordml" xmlns:w16du="http://schemas.microsoft.com/office/word/2023/wordml/word16du" xmlns:w16sdtdh="http://schemas.microsoft.com/office/word/2020/wordml/sdtdatahash" xmlns:w16sdtfl="http://schemas.microsoft.com/office/word/2024/wordml/sdtformatlock" xmlns:w16se="http://schemas.microsoft.com/office/word/2015/wordml/symex" xmlns:wpg="http://schemas.microsoft.com/office/word/2010/wordprocessingGroup" xmlns:wpi="http://schemas.microsoft.com/office/word/2010/wordprocessingInk" xmlns:wne="http://schemas.microsoft.com/office/word/2006/wordml" xmlns:wps="http://schemas.microsoft.com/office/word/2010/wordprocessingShape" mc:Ignorable="w14 w15 w16se w16cid w16 w16cex w16sdtdh w16sdtfl w16du wp14">
   <w:p>
     <w:pPr>
       <w:tabs>
@@ -7027,35 +6792,21 @@
       </w:rPr>
       <w:t xml:space="preserve"> de </w:t>
     </w:r>
-    <w:r>
-      <w:fldChar w:fldCharType="begin"/>
-    </w:r>
-    <w:r>
-      <w:instrText xml:space="preserve"> NUMPAGES   \* MERGEFORMAT </w:instrText>
-    </w:r>
-    <w:r>
-      <w:fldChar w:fldCharType="separate"/>
-    </w:r>
-    <w:r>
-      <w:rPr>
-        <w:rFonts w:ascii="Times New Roman" w:eastAsia="Times New Roman" w:hAnsi="Times New Roman" w:cs="Times New Roman"/>
-        <w:sz w:val="20"/>
-      </w:rPr>
-      <w:t>9</w:t>
-    </w:r>
-    <w:r>
-      <w:rPr>
-        <w:rFonts w:ascii="Times New Roman" w:eastAsia="Times New Roman" w:hAnsi="Times New Roman" w:cs="Times New Roman"/>
-        <w:sz w:val="20"/>
-      </w:rPr>
-      <w:fldChar w:fldCharType="end"/>
-    </w:r>
+    <w:fldSimple w:instr=" NUMPAGES   \* MERGEFORMAT ">
+      <w:r>
+        <w:rPr>
+          <w:rFonts w:ascii="Times New Roman" w:eastAsia="Times New Roman" w:hAnsi="Times New Roman" w:cs="Times New Roman"/>
+          <w:sz w:val="20"/>
+        </w:rPr>
+        <w:t>9</w:t>
+      </w:r>
+    </w:fldSimple>
   </w:p>
 </w:ftr>
 </file>
 
 <file path=word/footer2.xml><?xml version="1.0" encoding="utf-8"?>
-<w:ftr xmlns:wpc="http://schemas.microsoft.com/office/word/2010/wordprocessingCanvas" xmlns:cx="http://schemas.microsoft.com/office/drawing/2014/chartex" xmlns:cx1="http://schemas.microsoft.com/office/drawing/2015/9/8/chartex" xmlns:cx2="http://schemas.microsoft.com/office/drawing/2015/10/21/chartex" xmlns:cx3="http://schemas.microsoft.com/office/drawing/2016/5/9/chartex" xmlns:cx4="http://schemas.microsoft.com/office/drawing/2016/5/10/chartex" xmlns:cx5="http://schemas.microsoft.com/office/drawing/2016/5/11/chartex" xmlns:cx6="http://schemas.microsoft.com/office/drawing/2016/5/12/chartex" xmlns:cx7="http://schemas.microsoft.com/office/drawing/2016/5/13/chartex" xmlns:cx8="http://schemas.microsoft.com/office/drawing/2016/5/14/chartex" xmlns:mc="http://schemas.openxmlformats.org/markup-compatibility/2006" xmlns:aink="http://schemas.microsoft.com/office/drawing/2016/ink" xmlns:am3d="http://schemas.microsoft.com/office/drawing/2017/model3d" xmlns:o="urn:schemas-microsoft-com:office:office" xmlns:r="http://schemas.openxmlformats.org/officeDocument/2006/relationships" xmlns:m="http://schemas.openxmlformats.org/officeDocument/2006/math" xmlns:v="urn:schemas-microsoft-com:vml" xmlns:wp14="http://schemas.microsoft.com/office/word/2010/wordprocessingDrawing" xmlns:wp="http://schemas.openxmlformats.org/drawingml/2006/wordprocessingDrawing" xmlns:w10="urn:schemas-microsoft-com:office:word" xmlns:w="http://schemas.openxmlformats.org/wordprocessingml/2006/main" xmlns:w14="http://schemas.microsoft.com/office/word/2010/wordml" xmlns:w15="http://schemas.microsoft.com/office/word/2012/wordml" xmlns:w16cex="http://schemas.microsoft.com/office/word/2018/wordml/cex" xmlns:w16cid="http://schemas.microsoft.com/office/word/2016/wordml/cid" xmlns:w16="http://schemas.microsoft.com/office/word/2018/wordml" xmlns:w16sdtdh="http://schemas.microsoft.com/office/word/2020/wordml/sdtdatahash" xmlns:w16se="http://schemas.microsoft.com/office/word/2015/wordml/symex" xmlns:wpg="http://schemas.microsoft.com/office/word/2010/wordprocessingGroup" xmlns:wpi="http://schemas.microsoft.com/office/word/2010/wordprocessingInk" xmlns:wne="http://schemas.microsoft.com/office/word/2006/wordml" xmlns:wps="http://schemas.microsoft.com/office/word/2010/wordprocessingShape" mc:Ignorable="w14 w15 w16se w16cid w16 w16cex w16sdtdh wp14">
+<w:ftr xmlns:wpc="http://schemas.microsoft.com/office/word/2010/wordprocessingCanvas" xmlns:cx="http://schemas.microsoft.com/office/drawing/2014/chartex" xmlns:cx1="http://schemas.microsoft.com/office/drawing/2015/9/8/chartex" xmlns:cx2="http://schemas.microsoft.com/office/drawing/2015/10/21/chartex" xmlns:cx3="http://schemas.microsoft.com/office/drawing/2016/5/9/chartex" xmlns:cx4="http://schemas.microsoft.com/office/drawing/2016/5/10/chartex" xmlns:cx5="http://schemas.microsoft.com/office/drawing/2016/5/11/chartex" xmlns:cx6="http://schemas.microsoft.com/office/drawing/2016/5/12/chartex" xmlns:cx7="http://schemas.microsoft.com/office/drawing/2016/5/13/chartex" xmlns:cx8="http://schemas.microsoft.com/office/drawing/2016/5/14/chartex" xmlns:mc="http://schemas.openxmlformats.org/markup-compatibility/2006" xmlns:aink="http://schemas.microsoft.com/office/drawing/2016/ink" xmlns:am3d="http://schemas.microsoft.com/office/drawing/2017/model3d" xmlns:o="urn:schemas-microsoft-com:office:office" xmlns:oel="http://schemas.microsoft.com/office/2019/extlst" xmlns:r="http://schemas.openxmlformats.org/officeDocument/2006/relationships" xmlns:m="http://schemas.openxmlformats.org/officeDocument/2006/math" xmlns:v="urn:schemas-microsoft-com:vml" xmlns:wp14="http://schemas.microsoft.com/office/word/2010/wordprocessingDrawing" xmlns:wp="http://schemas.openxmlformats.org/drawingml/2006/wordprocessingDrawing" xmlns:w10="urn:schemas-microsoft-com:office:word" xmlns:w="http://schemas.openxmlformats.org/wordprocessingml/2006/main" xmlns:w14="http://schemas.microsoft.com/office/word/2010/wordml" xmlns:w15="http://schemas.microsoft.com/office/word/2012/wordml" xmlns:w16cex="http://schemas.microsoft.com/office/word/2018/wordml/cex" xmlns:w16cid="http://schemas.microsoft.com/office/word/2016/wordml/cid" xmlns:w16="http://schemas.microsoft.com/office/word/2018/wordml" xmlns:w16du="http://schemas.microsoft.com/office/word/2023/wordml/word16du" xmlns:w16sdtdh="http://schemas.microsoft.com/office/word/2020/wordml/sdtdatahash" xmlns:w16sdtfl="http://schemas.microsoft.com/office/word/2024/wordml/sdtformatlock" xmlns:w16se="http://schemas.microsoft.com/office/word/2015/wordml/symex" xmlns:wpg="http://schemas.microsoft.com/office/word/2010/wordprocessingGroup" xmlns:wpi="http://schemas.microsoft.com/office/word/2010/wordprocessingInk" xmlns:wne="http://schemas.microsoft.com/office/word/2006/wordml" xmlns:wps="http://schemas.microsoft.com/office/word/2010/wordprocessingShape" mc:Ignorable="w14 w15 w16se w16cid w16 w16cex w16sdtdh w16sdtfl w16du wp14">
   <w:tbl>
     <w:tblPr>
       <w:tblStyle w:val="Tablaconcuadrcula"/>
@@ -7099,23 +6850,7 @@
               <w:sz w:val="20"/>
               <w:szCs w:val="20"/>
             </w:rPr>
-            <w:t xml:space="preserve">ZABALBURU </w:t>
-          </w:r>
-          <w:proofErr w:type="spellStart"/>
-          <w:r>
-            <w:rPr>
-              <w:sz w:val="20"/>
-              <w:szCs w:val="20"/>
-            </w:rPr>
-            <w:t>Ikastetxea</w:t>
-          </w:r>
-          <w:proofErr w:type="spellEnd"/>
-          <w:r>
-            <w:rPr>
-              <w:sz w:val="20"/>
-              <w:szCs w:val="20"/>
-            </w:rPr>
-            <w:t xml:space="preserve"> </w:t>
+            <w:t xml:space="preserve">ZABALBURU Ikastetxea </w:t>
           </w:r>
         </w:p>
       </w:tc>
@@ -7160,7 +6895,7 @@
 </file>
 
 <file path=word/footer3.xml><?xml version="1.0" encoding="utf-8"?>
-<w:ftr xmlns:wpc="http://schemas.microsoft.com/office/word/2010/wordprocessingCanvas" xmlns:cx="http://schemas.microsoft.com/office/drawing/2014/chartex" xmlns:cx1="http://schemas.microsoft.com/office/drawing/2015/9/8/chartex" xmlns:cx2="http://schemas.microsoft.com/office/drawing/2015/10/21/chartex" xmlns:cx3="http://schemas.microsoft.com/office/drawing/2016/5/9/chartex" xmlns:cx4="http://schemas.microsoft.com/office/drawing/2016/5/10/chartex" xmlns:cx5="http://schemas.microsoft.com/office/drawing/2016/5/11/chartex" xmlns:cx6="http://schemas.microsoft.com/office/drawing/2016/5/12/chartex" xmlns:cx7="http://schemas.microsoft.com/office/drawing/2016/5/13/chartex" xmlns:cx8="http://schemas.microsoft.com/office/drawing/2016/5/14/chartex" xmlns:mc="http://schemas.openxmlformats.org/markup-compatibility/2006" xmlns:aink="http://schemas.microsoft.com/office/drawing/2016/ink" xmlns:am3d="http://schemas.microsoft.com/office/drawing/2017/model3d" xmlns:o="urn:schemas-microsoft-com:office:office" xmlns:r="http://schemas.openxmlformats.org/officeDocument/2006/relationships" xmlns:m="http://schemas.openxmlformats.org/officeDocument/2006/math" xmlns:v="urn:schemas-microsoft-com:vml" xmlns:wp14="http://schemas.microsoft.com/office/word/2010/wordprocessingDrawing" xmlns:wp="http://schemas.openxmlformats.org/drawingml/2006/wordprocessingDrawing" xmlns:w10="urn:schemas-microsoft-com:office:word" xmlns:w="http://schemas.openxmlformats.org/wordprocessingml/2006/main" xmlns:w14="http://schemas.microsoft.com/office/word/2010/wordml" xmlns:w15="http://schemas.microsoft.com/office/word/2012/wordml" xmlns:w16cex="http://schemas.microsoft.com/office/word/2018/wordml/cex" xmlns:w16cid="http://schemas.microsoft.com/office/word/2016/wordml/cid" xmlns:w16="http://schemas.microsoft.com/office/word/2018/wordml" xmlns:w16sdtdh="http://schemas.microsoft.com/office/word/2020/wordml/sdtdatahash" xmlns:w16se="http://schemas.microsoft.com/office/word/2015/wordml/symex" xmlns:wpg="http://schemas.microsoft.com/office/word/2010/wordprocessingGroup" xmlns:wpi="http://schemas.microsoft.com/office/word/2010/wordprocessingInk" xmlns:wne="http://schemas.microsoft.com/office/word/2006/wordml" xmlns:wps="http://schemas.microsoft.com/office/word/2010/wordprocessingShape" mc:Ignorable="w14 w15 w16se w16cid w16 w16cex w16sdtdh wp14">
+<w:ftr xmlns:wpc="http://schemas.microsoft.com/office/word/2010/wordprocessingCanvas" xmlns:cx="http://schemas.microsoft.com/office/drawing/2014/chartex" xmlns:cx1="http://schemas.microsoft.com/office/drawing/2015/9/8/chartex" xmlns:cx2="http://schemas.microsoft.com/office/drawing/2015/10/21/chartex" xmlns:cx3="http://schemas.microsoft.com/office/drawing/2016/5/9/chartex" xmlns:cx4="http://schemas.microsoft.com/office/drawing/2016/5/10/chartex" xmlns:cx5="http://schemas.microsoft.com/office/drawing/2016/5/11/chartex" xmlns:cx6="http://schemas.microsoft.com/office/drawing/2016/5/12/chartex" xmlns:cx7="http://schemas.microsoft.com/office/drawing/2016/5/13/chartex" xmlns:cx8="http://schemas.microsoft.com/office/drawing/2016/5/14/chartex" xmlns:mc="http://schemas.openxmlformats.org/markup-compatibility/2006" xmlns:aink="http://schemas.microsoft.com/office/drawing/2016/ink" xmlns:am3d="http://schemas.microsoft.com/office/drawing/2017/model3d" xmlns:o="urn:schemas-microsoft-com:office:office" xmlns:oel="http://schemas.microsoft.com/office/2019/extlst" xmlns:r="http://schemas.openxmlformats.org/officeDocument/2006/relationships" xmlns:m="http://schemas.openxmlformats.org/officeDocument/2006/math" xmlns:v="urn:schemas-microsoft-com:vml" xmlns:wp14="http://schemas.microsoft.com/office/word/2010/wordprocessingDrawing" xmlns:wp="http://schemas.openxmlformats.org/drawingml/2006/wordprocessingDrawing" xmlns:w10="urn:schemas-microsoft-com:office:word" xmlns:w="http://schemas.openxmlformats.org/wordprocessingml/2006/main" xmlns:w14="http://schemas.microsoft.com/office/word/2010/wordml" xmlns:w15="http://schemas.microsoft.com/office/word/2012/wordml" xmlns:w16cex="http://schemas.microsoft.com/office/word/2018/wordml/cex" xmlns:w16cid="http://schemas.microsoft.com/office/word/2016/wordml/cid" xmlns:w16="http://schemas.microsoft.com/office/word/2018/wordml" xmlns:w16du="http://schemas.microsoft.com/office/word/2023/wordml/word16du" xmlns:w16sdtdh="http://schemas.microsoft.com/office/word/2020/wordml/sdtdatahash" xmlns:w16sdtfl="http://schemas.microsoft.com/office/word/2024/wordml/sdtformatlock" xmlns:w16se="http://schemas.microsoft.com/office/word/2015/wordml/symex" xmlns:wpg="http://schemas.microsoft.com/office/word/2010/wordprocessingGroup" xmlns:wpi="http://schemas.microsoft.com/office/word/2010/wordprocessingInk" xmlns:wne="http://schemas.microsoft.com/office/word/2006/wordml" xmlns:wps="http://schemas.microsoft.com/office/word/2010/wordprocessingShape" mc:Ignorable="w14 w15 w16se w16cid w16 w16cex w16sdtdh w16sdtfl w16du wp14">
   <w:p>
     <w:pPr>
       <w:tabs>
@@ -7313,35 +7048,21 @@
       </w:rPr>
       <w:t xml:space="preserve"> de </w:t>
     </w:r>
-    <w:r>
-      <w:fldChar w:fldCharType="begin"/>
-    </w:r>
-    <w:r>
-      <w:instrText xml:space="preserve"> NUMPAGES   \* MERGEFORMAT </w:instrText>
-    </w:r>
-    <w:r>
-      <w:fldChar w:fldCharType="separate"/>
-    </w:r>
-    <w:r>
-      <w:rPr>
-        <w:rFonts w:ascii="Times New Roman" w:eastAsia="Times New Roman" w:hAnsi="Times New Roman" w:cs="Times New Roman"/>
-        <w:sz w:val="20"/>
-      </w:rPr>
-      <w:t>9</w:t>
-    </w:r>
-    <w:r>
-      <w:rPr>
-        <w:rFonts w:ascii="Times New Roman" w:eastAsia="Times New Roman" w:hAnsi="Times New Roman" w:cs="Times New Roman"/>
-        <w:sz w:val="20"/>
-      </w:rPr>
-      <w:fldChar w:fldCharType="end"/>
-    </w:r>
+    <w:fldSimple w:instr=" NUMPAGES   \* MERGEFORMAT ">
+      <w:r>
+        <w:rPr>
+          <w:rFonts w:ascii="Times New Roman" w:eastAsia="Times New Roman" w:hAnsi="Times New Roman" w:cs="Times New Roman"/>
+          <w:sz w:val="20"/>
+        </w:rPr>
+        <w:t>9</w:t>
+      </w:r>
+    </w:fldSimple>
   </w:p>
 </w:ftr>
 </file>
 
 <file path=word/footnotes.xml><?xml version="1.0" encoding="utf-8"?>
-<w:footnotes xmlns:wpc="http://schemas.microsoft.com/office/word/2010/wordprocessingCanvas" xmlns:cx="http://schemas.microsoft.com/office/drawing/2014/chartex" xmlns:cx1="http://schemas.microsoft.com/office/drawing/2015/9/8/chartex" xmlns:cx2="http://schemas.microsoft.com/office/drawing/2015/10/21/chartex" xmlns:cx3="http://schemas.microsoft.com/office/drawing/2016/5/9/chartex" xmlns:cx4="http://schemas.microsoft.com/office/drawing/2016/5/10/chartex" xmlns:cx5="http://schemas.microsoft.com/office/drawing/2016/5/11/chartex" xmlns:cx6="http://schemas.microsoft.com/office/drawing/2016/5/12/chartex" xmlns:cx7="http://schemas.microsoft.com/office/drawing/2016/5/13/chartex" xmlns:cx8="http://schemas.microsoft.com/office/drawing/2016/5/14/chartex" xmlns:mc="http://schemas.openxmlformats.org/markup-compatibility/2006" xmlns:aink="http://schemas.microsoft.com/office/drawing/2016/ink" xmlns:am3d="http://schemas.microsoft.com/office/drawing/2017/model3d" xmlns:o="urn:schemas-microsoft-com:office:office" xmlns:r="http://schemas.openxmlformats.org/officeDocument/2006/relationships" xmlns:m="http://schemas.openxmlformats.org/officeDocument/2006/math" xmlns:v="urn:schemas-microsoft-com:vml" xmlns:wp14="http://schemas.microsoft.com/office/word/2010/wordprocessingDrawing" xmlns:wp="http://schemas.openxmlformats.org/drawingml/2006/wordprocessingDrawing" xmlns:w10="urn:schemas-microsoft-com:office:word" xmlns:w="http://schemas.openxmlformats.org/wordprocessingml/2006/main" xmlns:w14="http://schemas.microsoft.com/office/word/2010/wordml" xmlns:w15="http://schemas.microsoft.com/office/word/2012/wordml" xmlns:w16cex="http://schemas.microsoft.com/office/word/2018/wordml/cex" xmlns:w16cid="http://schemas.microsoft.com/office/word/2016/wordml/cid" xmlns:w16="http://schemas.microsoft.com/office/word/2018/wordml" xmlns:w16sdtdh="http://schemas.microsoft.com/office/word/2020/wordml/sdtdatahash" xmlns:w16se="http://schemas.microsoft.com/office/word/2015/wordml/symex" xmlns:wpg="http://schemas.microsoft.com/office/word/2010/wordprocessingGroup" xmlns:wpi="http://schemas.microsoft.com/office/word/2010/wordprocessingInk" xmlns:wne="http://schemas.microsoft.com/office/word/2006/wordml" xmlns:wps="http://schemas.microsoft.com/office/word/2010/wordprocessingShape" mc:Ignorable="w14 w15 w16se w16cid w16 w16cex w16sdtdh wp14">
+<w:footnotes xmlns:wpc="http://schemas.microsoft.com/office/word/2010/wordprocessingCanvas" xmlns:cx="http://schemas.microsoft.com/office/drawing/2014/chartex" xmlns:cx1="http://schemas.microsoft.com/office/drawing/2015/9/8/chartex" xmlns:cx2="http://schemas.microsoft.com/office/drawing/2015/10/21/chartex" xmlns:cx3="http://schemas.microsoft.com/office/drawing/2016/5/9/chartex" xmlns:cx4="http://schemas.microsoft.com/office/drawing/2016/5/10/chartex" xmlns:cx5="http://schemas.microsoft.com/office/drawing/2016/5/11/chartex" xmlns:cx6="http://schemas.microsoft.com/office/drawing/2016/5/12/chartex" xmlns:cx7="http://schemas.microsoft.com/office/drawing/2016/5/13/chartex" xmlns:cx8="http://schemas.microsoft.com/office/drawing/2016/5/14/chartex" xmlns:mc="http://schemas.openxmlformats.org/markup-compatibility/2006" xmlns:aink="http://schemas.microsoft.com/office/drawing/2016/ink" xmlns:am3d="http://schemas.microsoft.com/office/drawing/2017/model3d" xmlns:o="urn:schemas-microsoft-com:office:office" xmlns:oel="http://schemas.microsoft.com/office/2019/extlst" xmlns:r="http://schemas.openxmlformats.org/officeDocument/2006/relationships" xmlns:m="http://schemas.openxmlformats.org/officeDocument/2006/math" xmlns:v="urn:schemas-microsoft-com:vml" xmlns:wp14="http://schemas.microsoft.com/office/word/2010/wordprocessingDrawing" xmlns:wp="http://schemas.openxmlformats.org/drawingml/2006/wordprocessingDrawing" xmlns:w10="urn:schemas-microsoft-com:office:word" xmlns:w="http://schemas.openxmlformats.org/wordprocessingml/2006/main" xmlns:w14="http://schemas.microsoft.com/office/word/2010/wordml" xmlns:w15="http://schemas.microsoft.com/office/word/2012/wordml" xmlns:w16cex="http://schemas.microsoft.com/office/word/2018/wordml/cex" xmlns:w16cid="http://schemas.microsoft.com/office/word/2016/wordml/cid" xmlns:w16="http://schemas.microsoft.com/office/word/2018/wordml" xmlns:w16du="http://schemas.microsoft.com/office/word/2023/wordml/word16du" xmlns:w16sdtdh="http://schemas.microsoft.com/office/word/2020/wordml/sdtdatahash" xmlns:w16sdtfl="http://schemas.microsoft.com/office/word/2024/wordml/sdtformatlock" xmlns:w16se="http://schemas.microsoft.com/office/word/2015/wordml/symex" xmlns:wpg="http://schemas.microsoft.com/office/word/2010/wordprocessingGroup" xmlns:wpi="http://schemas.microsoft.com/office/word/2010/wordprocessingInk" xmlns:wne="http://schemas.microsoft.com/office/word/2006/wordml" xmlns:wps="http://schemas.microsoft.com/office/word/2010/wordprocessingShape" mc:Ignorable="w14 w15 w16se w16cid w16 w16cex w16sdtdh w16sdtfl w16du wp14">
   <w:footnote w:type="separator" w:id="-1">
     <w:p>
       <w:pPr>
@@ -7366,7 +7087,7 @@
 </file>
 
 <file path=word/header1.xml><?xml version="1.0" encoding="utf-8"?>
-<w:hdr xmlns:wpc="http://schemas.microsoft.com/office/word/2010/wordprocessingCanvas" xmlns:cx="http://schemas.microsoft.com/office/drawing/2014/chartex" xmlns:cx1="http://schemas.microsoft.com/office/drawing/2015/9/8/chartex" xmlns:cx2="http://schemas.microsoft.com/office/drawing/2015/10/21/chartex" xmlns:cx3="http://schemas.microsoft.com/office/drawing/2016/5/9/chartex" xmlns:cx4="http://schemas.microsoft.com/office/drawing/2016/5/10/chartex" xmlns:cx5="http://schemas.microsoft.com/office/drawing/2016/5/11/chartex" xmlns:cx6="http://schemas.microsoft.com/office/drawing/2016/5/12/chartex" xmlns:cx7="http://schemas.microsoft.com/office/drawing/2016/5/13/chartex" xmlns:cx8="http://schemas.microsoft.com/office/drawing/2016/5/14/chartex" xmlns:mc="http://schemas.openxmlformats.org/markup-compatibility/2006" xmlns:aink="http://schemas.microsoft.com/office/drawing/2016/ink" xmlns:am3d="http://schemas.microsoft.com/office/drawing/2017/model3d" xmlns:o="urn:schemas-microsoft-com:office:office" xmlns:r="http://schemas.openxmlformats.org/officeDocument/2006/relationships" xmlns:m="http://schemas.openxmlformats.org/officeDocument/2006/math" xmlns:v="urn:schemas-microsoft-com:vml" xmlns:wp14="http://schemas.microsoft.com/office/word/2010/wordprocessingDrawing" xmlns:wp="http://schemas.openxmlformats.org/drawingml/2006/wordprocessingDrawing" xmlns:w10="urn:schemas-microsoft-com:office:word" xmlns:w="http://schemas.openxmlformats.org/wordprocessingml/2006/main" xmlns:w14="http://schemas.microsoft.com/office/word/2010/wordml" xmlns:w15="http://schemas.microsoft.com/office/word/2012/wordml" xmlns:w16cex="http://schemas.microsoft.com/office/word/2018/wordml/cex" xmlns:w16cid="http://schemas.microsoft.com/office/word/2016/wordml/cid" xmlns:w16="http://schemas.microsoft.com/office/word/2018/wordml" xmlns:w16sdtdh="http://schemas.microsoft.com/office/word/2020/wordml/sdtdatahash" xmlns:w16se="http://schemas.microsoft.com/office/word/2015/wordml/symex" xmlns:wpg="http://schemas.microsoft.com/office/word/2010/wordprocessingGroup" xmlns:wpi="http://schemas.microsoft.com/office/word/2010/wordprocessingInk" xmlns:wne="http://schemas.microsoft.com/office/word/2006/wordml" xmlns:wps="http://schemas.microsoft.com/office/word/2010/wordprocessingShape" mc:Ignorable="w14 w15 w16se w16cid w16 w16cex w16sdtdh wp14">
+<w:hdr xmlns:wpc="http://schemas.microsoft.com/office/word/2010/wordprocessingCanvas" xmlns:cx="http://schemas.microsoft.com/office/drawing/2014/chartex" xmlns:cx1="http://schemas.microsoft.com/office/drawing/2015/9/8/chartex" xmlns:cx2="http://schemas.microsoft.com/office/drawing/2015/10/21/chartex" xmlns:cx3="http://schemas.microsoft.com/office/drawing/2016/5/9/chartex" xmlns:cx4="http://schemas.microsoft.com/office/drawing/2016/5/10/chartex" xmlns:cx5="http://schemas.microsoft.com/office/drawing/2016/5/11/chartex" xmlns:cx6="http://schemas.microsoft.com/office/drawing/2016/5/12/chartex" xmlns:cx7="http://schemas.microsoft.com/office/drawing/2016/5/13/chartex" xmlns:cx8="http://schemas.microsoft.com/office/drawing/2016/5/14/chartex" xmlns:mc="http://schemas.openxmlformats.org/markup-compatibility/2006" xmlns:aink="http://schemas.microsoft.com/office/drawing/2016/ink" xmlns:am3d="http://schemas.microsoft.com/office/drawing/2017/model3d" xmlns:o="urn:schemas-microsoft-com:office:office" xmlns:oel="http://schemas.microsoft.com/office/2019/extlst" xmlns:r="http://schemas.openxmlformats.org/officeDocument/2006/relationships" xmlns:m="http://schemas.openxmlformats.org/officeDocument/2006/math" xmlns:v="urn:schemas-microsoft-com:vml" xmlns:wp14="http://schemas.microsoft.com/office/word/2010/wordprocessingDrawing" xmlns:wp="http://schemas.openxmlformats.org/drawingml/2006/wordprocessingDrawing" xmlns:w10="urn:schemas-microsoft-com:office:word" xmlns:w="http://schemas.openxmlformats.org/wordprocessingml/2006/main" xmlns:w14="http://schemas.microsoft.com/office/word/2010/wordml" xmlns:w15="http://schemas.microsoft.com/office/word/2012/wordml" xmlns:w16cex="http://schemas.microsoft.com/office/word/2018/wordml/cex" xmlns:w16cid="http://schemas.microsoft.com/office/word/2016/wordml/cid" xmlns:w16="http://schemas.microsoft.com/office/word/2018/wordml" xmlns:w16du="http://schemas.microsoft.com/office/word/2023/wordml/word16du" xmlns:w16sdtdh="http://schemas.microsoft.com/office/word/2020/wordml/sdtdatahash" xmlns:w16sdtfl="http://schemas.microsoft.com/office/word/2024/wordml/sdtformatlock" xmlns:w16se="http://schemas.microsoft.com/office/word/2015/wordml/symex" xmlns:wpg="http://schemas.microsoft.com/office/word/2010/wordprocessingGroup" xmlns:wpi="http://schemas.microsoft.com/office/word/2010/wordprocessingInk" xmlns:wne="http://schemas.microsoft.com/office/word/2006/wordml" xmlns:wps="http://schemas.microsoft.com/office/word/2010/wordprocessingShape" mc:Ignorable="w14 w15 w16se w16cid w16 w16cex w16sdtdh w16sdtfl w16du wp14">
   <w:p>
     <w:pPr>
       <w:tabs>
@@ -7494,7 +7215,7 @@
 </file>
 
 <file path=word/header2.xml><?xml version="1.0" encoding="utf-8"?>
-<w:hdr xmlns:wpc="http://schemas.microsoft.com/office/word/2010/wordprocessingCanvas" xmlns:cx="http://schemas.microsoft.com/office/drawing/2014/chartex" xmlns:cx1="http://schemas.microsoft.com/office/drawing/2015/9/8/chartex" xmlns:cx2="http://schemas.microsoft.com/office/drawing/2015/10/21/chartex" xmlns:cx3="http://schemas.microsoft.com/office/drawing/2016/5/9/chartex" xmlns:cx4="http://schemas.microsoft.com/office/drawing/2016/5/10/chartex" xmlns:cx5="http://schemas.microsoft.com/office/drawing/2016/5/11/chartex" xmlns:cx6="http://schemas.microsoft.com/office/drawing/2016/5/12/chartex" xmlns:cx7="http://schemas.microsoft.com/office/drawing/2016/5/13/chartex" xmlns:cx8="http://schemas.microsoft.com/office/drawing/2016/5/14/chartex" xmlns:mc="http://schemas.openxmlformats.org/markup-compatibility/2006" xmlns:aink="http://schemas.microsoft.com/office/drawing/2016/ink" xmlns:am3d="http://schemas.microsoft.com/office/drawing/2017/model3d" xmlns:o="urn:schemas-microsoft-com:office:office" xmlns:r="http://schemas.openxmlformats.org/officeDocument/2006/relationships" xmlns:m="http://schemas.openxmlformats.org/officeDocument/2006/math" xmlns:v="urn:schemas-microsoft-com:vml" xmlns:wp14="http://schemas.microsoft.com/office/word/2010/wordprocessingDrawing" xmlns:wp="http://schemas.openxmlformats.org/drawingml/2006/wordprocessingDrawing" xmlns:w10="urn:schemas-microsoft-com:office:word" xmlns:w="http://schemas.openxmlformats.org/wordprocessingml/2006/main" xmlns:w14="http://schemas.microsoft.com/office/word/2010/wordml" xmlns:w15="http://schemas.microsoft.com/office/word/2012/wordml" xmlns:w16cex="http://schemas.microsoft.com/office/word/2018/wordml/cex" xmlns:w16cid="http://schemas.microsoft.com/office/word/2016/wordml/cid" xmlns:w16="http://schemas.microsoft.com/office/word/2018/wordml" xmlns:w16sdtdh="http://schemas.microsoft.com/office/word/2020/wordml/sdtdatahash" xmlns:w16se="http://schemas.microsoft.com/office/word/2015/wordml/symex" xmlns:wpg="http://schemas.microsoft.com/office/word/2010/wordprocessingGroup" xmlns:wpi="http://schemas.microsoft.com/office/word/2010/wordprocessingInk" xmlns:wne="http://schemas.microsoft.com/office/word/2006/wordml" xmlns:wps="http://schemas.microsoft.com/office/word/2010/wordprocessingShape" mc:Ignorable="w14 w15 w16se w16cid w16 w16cex w16sdtdh wp14">
+<w:hdr xmlns:wpc="http://schemas.microsoft.com/office/word/2010/wordprocessingCanvas" xmlns:cx="http://schemas.microsoft.com/office/drawing/2014/chartex" xmlns:cx1="http://schemas.microsoft.com/office/drawing/2015/9/8/chartex" xmlns:cx2="http://schemas.microsoft.com/office/drawing/2015/10/21/chartex" xmlns:cx3="http://schemas.microsoft.com/office/drawing/2016/5/9/chartex" xmlns:cx4="http://schemas.microsoft.com/office/drawing/2016/5/10/chartex" xmlns:cx5="http://schemas.microsoft.com/office/drawing/2016/5/11/chartex" xmlns:cx6="http://schemas.microsoft.com/office/drawing/2016/5/12/chartex" xmlns:cx7="http://schemas.microsoft.com/office/drawing/2016/5/13/chartex" xmlns:cx8="http://schemas.microsoft.com/office/drawing/2016/5/14/chartex" xmlns:mc="http://schemas.openxmlformats.org/markup-compatibility/2006" xmlns:aink="http://schemas.microsoft.com/office/drawing/2016/ink" xmlns:am3d="http://schemas.microsoft.com/office/drawing/2017/model3d" xmlns:o="urn:schemas-microsoft-com:office:office" xmlns:oel="http://schemas.microsoft.com/office/2019/extlst" xmlns:r="http://schemas.openxmlformats.org/officeDocument/2006/relationships" xmlns:m="http://schemas.openxmlformats.org/officeDocument/2006/math" xmlns:v="urn:schemas-microsoft-com:vml" xmlns:wp14="http://schemas.microsoft.com/office/word/2010/wordprocessingDrawing" xmlns:wp="http://schemas.openxmlformats.org/drawingml/2006/wordprocessingDrawing" xmlns:w10="urn:schemas-microsoft-com:office:word" xmlns:w="http://schemas.openxmlformats.org/wordprocessingml/2006/main" xmlns:w14="http://schemas.microsoft.com/office/word/2010/wordml" xmlns:w15="http://schemas.microsoft.com/office/word/2012/wordml" xmlns:w16cex="http://schemas.microsoft.com/office/word/2018/wordml/cex" xmlns:w16cid="http://schemas.microsoft.com/office/word/2016/wordml/cid" xmlns:w16="http://schemas.microsoft.com/office/word/2018/wordml" xmlns:w16du="http://schemas.microsoft.com/office/word/2023/wordml/word16du" xmlns:w16sdtdh="http://schemas.microsoft.com/office/word/2020/wordml/sdtdatahash" xmlns:w16sdtfl="http://schemas.microsoft.com/office/word/2024/wordml/sdtformatlock" xmlns:w16se="http://schemas.microsoft.com/office/word/2015/wordml/symex" xmlns:wpg="http://schemas.microsoft.com/office/word/2010/wordprocessingGroup" xmlns:wpi="http://schemas.microsoft.com/office/word/2010/wordprocessingInk" xmlns:wne="http://schemas.microsoft.com/office/word/2006/wordml" xmlns:wps="http://schemas.microsoft.com/office/word/2010/wordprocessingShape" mc:Ignorable="w14 w15 w16se w16cid w16 w16cex w16sdtdh w16sdtfl w16du wp14">
   <w:tbl>
     <w:tblPr>
       <w:tblStyle w:val="Tablaconcuadrcula"/>
@@ -7645,13 +7366,7 @@
             <w:rPr>
               <w:smallCaps/>
             </w:rPr>
-            <w:t xml:space="preserve"> </w:t>
-          </w:r>
-          <w:r>
-            <w:rPr>
-              <w:smallCaps/>
-            </w:rPr>
-            <w:t>Bases de Datos</w:t>
+            <w:t xml:space="preserve"> Bases de Datos</w:t>
           </w:r>
         </w:p>
       </w:tc>
@@ -7666,7 +7381,7 @@
 </file>
 
 <file path=word/header3.xml><?xml version="1.0" encoding="utf-8"?>
-<w:hdr xmlns:wpc="http://schemas.microsoft.com/office/word/2010/wordprocessingCanvas" xmlns:cx="http://schemas.microsoft.com/office/drawing/2014/chartex" xmlns:cx1="http://schemas.microsoft.com/office/drawing/2015/9/8/chartex" xmlns:cx2="http://schemas.microsoft.com/office/drawing/2015/10/21/chartex" xmlns:cx3="http://schemas.microsoft.com/office/drawing/2016/5/9/chartex" xmlns:cx4="http://schemas.microsoft.com/office/drawing/2016/5/10/chartex" xmlns:cx5="http://schemas.microsoft.com/office/drawing/2016/5/11/chartex" xmlns:cx6="http://schemas.microsoft.com/office/drawing/2016/5/12/chartex" xmlns:cx7="http://schemas.microsoft.com/office/drawing/2016/5/13/chartex" xmlns:cx8="http://schemas.microsoft.com/office/drawing/2016/5/14/chartex" xmlns:mc="http://schemas.openxmlformats.org/markup-compatibility/2006" xmlns:aink="http://schemas.microsoft.com/office/drawing/2016/ink" xmlns:am3d="http://schemas.microsoft.com/office/drawing/2017/model3d" xmlns:o="urn:schemas-microsoft-com:office:office" xmlns:r="http://schemas.openxmlformats.org/officeDocument/2006/relationships" xmlns:m="http://schemas.openxmlformats.org/officeDocument/2006/math" xmlns:v="urn:schemas-microsoft-com:vml" xmlns:wp14="http://schemas.microsoft.com/office/word/2010/wordprocessingDrawing" xmlns:wp="http://schemas.openxmlformats.org/drawingml/2006/wordprocessingDrawing" xmlns:w10="urn:schemas-microsoft-com:office:word" xmlns:w="http://schemas.openxmlformats.org/wordprocessingml/2006/main" xmlns:w14="http://schemas.microsoft.com/office/word/2010/wordml" xmlns:w15="http://schemas.microsoft.com/office/word/2012/wordml" xmlns:w16cex="http://schemas.microsoft.com/office/word/2018/wordml/cex" xmlns:w16cid="http://schemas.microsoft.com/office/word/2016/wordml/cid" xmlns:w16="http://schemas.microsoft.com/office/word/2018/wordml" xmlns:w16sdtdh="http://schemas.microsoft.com/office/word/2020/wordml/sdtdatahash" xmlns:w16se="http://schemas.microsoft.com/office/word/2015/wordml/symex" xmlns:wpg="http://schemas.microsoft.com/office/word/2010/wordprocessingGroup" xmlns:wpi="http://schemas.microsoft.com/office/word/2010/wordprocessingInk" xmlns:wne="http://schemas.microsoft.com/office/word/2006/wordml" xmlns:wps="http://schemas.microsoft.com/office/word/2010/wordprocessingShape" mc:Ignorable="w14 w15 w16se w16cid w16 w16cex w16sdtdh wp14">
+<w:hdr xmlns:wpc="http://schemas.microsoft.com/office/word/2010/wordprocessingCanvas" xmlns:cx="http://schemas.microsoft.com/office/drawing/2014/chartex" xmlns:cx1="http://schemas.microsoft.com/office/drawing/2015/9/8/chartex" xmlns:cx2="http://schemas.microsoft.com/office/drawing/2015/10/21/chartex" xmlns:cx3="http://schemas.microsoft.com/office/drawing/2016/5/9/chartex" xmlns:cx4="http://schemas.microsoft.com/office/drawing/2016/5/10/chartex" xmlns:cx5="http://schemas.microsoft.com/office/drawing/2016/5/11/chartex" xmlns:cx6="http://schemas.microsoft.com/office/drawing/2016/5/12/chartex" xmlns:cx7="http://schemas.microsoft.com/office/drawing/2016/5/13/chartex" xmlns:cx8="http://schemas.microsoft.com/office/drawing/2016/5/14/chartex" xmlns:mc="http://schemas.openxmlformats.org/markup-compatibility/2006" xmlns:aink="http://schemas.microsoft.com/office/drawing/2016/ink" xmlns:am3d="http://schemas.microsoft.com/office/drawing/2017/model3d" xmlns:o="urn:schemas-microsoft-com:office:office" xmlns:oel="http://schemas.microsoft.com/office/2019/extlst" xmlns:r="http://schemas.openxmlformats.org/officeDocument/2006/relationships" xmlns:m="http://schemas.openxmlformats.org/officeDocument/2006/math" xmlns:v="urn:schemas-microsoft-com:vml" xmlns:wp14="http://schemas.microsoft.com/office/word/2010/wordprocessingDrawing" xmlns:wp="http://schemas.openxmlformats.org/drawingml/2006/wordprocessingDrawing" xmlns:w10="urn:schemas-microsoft-com:office:word" xmlns:w="http://schemas.openxmlformats.org/wordprocessingml/2006/main" xmlns:w14="http://schemas.microsoft.com/office/word/2010/wordml" xmlns:w15="http://schemas.microsoft.com/office/word/2012/wordml" xmlns:w16cex="http://schemas.microsoft.com/office/word/2018/wordml/cex" xmlns:w16cid="http://schemas.microsoft.com/office/word/2016/wordml/cid" xmlns:w16="http://schemas.microsoft.com/office/word/2018/wordml" xmlns:w16du="http://schemas.microsoft.com/office/word/2023/wordml/word16du" xmlns:w16sdtdh="http://schemas.microsoft.com/office/word/2020/wordml/sdtdatahash" xmlns:w16sdtfl="http://schemas.microsoft.com/office/word/2024/wordml/sdtformatlock" xmlns:w16se="http://schemas.microsoft.com/office/word/2015/wordml/symex" xmlns:wpg="http://schemas.microsoft.com/office/word/2010/wordprocessingGroup" xmlns:wpi="http://schemas.microsoft.com/office/word/2010/wordprocessingInk" xmlns:wne="http://schemas.microsoft.com/office/word/2006/wordml" xmlns:wps="http://schemas.microsoft.com/office/word/2010/wordprocessingShape" mc:Ignorable="w14 w15 w16se w16cid w16 w16cex w16sdtdh w16sdtfl w16du wp14">
   <w:p>
     <w:pPr>
       <w:tabs>
@@ -7794,7 +7509,7 @@
 </file>
 
 <file path=word/styles.xml><?xml version="1.0" encoding="utf-8"?>
-<w:styles xmlns:mc="http://schemas.openxmlformats.org/markup-compatibility/2006" xmlns:r="http://schemas.openxmlformats.org/officeDocument/2006/relationships" xmlns:w="http://schemas.openxmlformats.org/wordprocessingml/2006/main" xmlns:w14="http://schemas.microsoft.com/office/word/2010/wordml" xmlns:w15="http://schemas.microsoft.com/office/word/2012/wordml" xmlns:w16cex="http://schemas.microsoft.com/office/word/2018/wordml/cex" xmlns:w16cid="http://schemas.microsoft.com/office/word/2016/wordml/cid" xmlns:w16="http://schemas.microsoft.com/office/word/2018/wordml" xmlns:w16sdtdh="http://schemas.microsoft.com/office/word/2020/wordml/sdtdatahash" xmlns:w16se="http://schemas.microsoft.com/office/word/2015/wordml/symex" mc:Ignorable="w14 w15 w16se w16cid w16 w16cex w16sdtdh">
+<w:styles xmlns:mc="http://schemas.openxmlformats.org/markup-compatibility/2006" xmlns:r="http://schemas.openxmlformats.org/officeDocument/2006/relationships" xmlns:w="http://schemas.openxmlformats.org/wordprocessingml/2006/main" xmlns:w14="http://schemas.microsoft.com/office/word/2010/wordml" xmlns:w15="http://schemas.microsoft.com/office/word/2012/wordml" xmlns:w16cex="http://schemas.microsoft.com/office/word/2018/wordml/cex" xmlns:w16cid="http://schemas.microsoft.com/office/word/2016/wordml/cid" xmlns:w16="http://schemas.microsoft.com/office/word/2018/wordml" xmlns:w16du="http://schemas.microsoft.com/office/word/2023/wordml/word16du" xmlns:w16sdtdh="http://schemas.microsoft.com/office/word/2020/wordml/sdtdatahash" xmlns:w16sdtfl="http://schemas.microsoft.com/office/word/2024/wordml/sdtformatlock" xmlns:w16se="http://schemas.microsoft.com/office/word/2015/wordml/symex" mc:Ignorable="w14 w15 w16se w16cid w16 w16cex w16sdtdh w16sdtfl w16du">
   <w:docDefaults>
     <w:rPrDefault>
       <w:rPr>

</xml_diff>